<commit_message>
La till text i notebook för fråga 3, även resultat och slutsats (preliminär) i rapport, och ändrade filnamn.
</commit_message>
<xml_diff>
--- a/Grupp 3, R - rapport.docx
+++ b/Grupp 3, R - rapport.docx
@@ -668,8 +668,186 @@
           <w:rFonts w:ascii="Times New Roman" w:eastAsia="Times New Roman" w:hAnsi="Times New Roman" w:cs="Times New Roman"/>
           <w:sz w:val="24"/>
           <w:szCs w:val="24"/>
-        </w:rPr>
-      </w:pPr>
+          <w:lang w:val="sv-SE"/>
+        </w:rPr>
+      </w:pPr>
+      <w:r>
+        <w:rPr>
+          <w:rFonts w:ascii="Times New Roman" w:eastAsia="Times New Roman" w:hAnsi="Times New Roman" w:cs="Times New Roman"/>
+          <w:sz w:val="24"/>
+          <w:szCs w:val="24"/>
+          <w:u w:val="single"/>
+          <w:lang w:val="sv-SE"/>
+        </w:rPr>
+        <w:t>Intäkter:</w:t>
+      </w:r>
+    </w:p>
+    <w:p>
+      <w:pPr>
+        <w:rPr>
+          <w:rFonts w:ascii="Times New Roman" w:eastAsia="Times New Roman" w:hAnsi="Times New Roman" w:cs="Times New Roman"/>
+          <w:sz w:val="24"/>
+          <w:szCs w:val="24"/>
+          <w:lang w:val="sv-SE"/>
+        </w:rPr>
+      </w:pPr>
+      <w:r>
+        <w:rPr>
+          <w:rFonts w:ascii="Times New Roman" w:eastAsia="Times New Roman" w:hAnsi="Times New Roman" w:cs="Times New Roman"/>
+          <w:sz w:val="24"/>
+          <w:szCs w:val="24"/>
+          <w:lang w:val="sv-SE"/>
+        </w:rPr>
+        <w:t>Elektronik står för största delen av intäkter, efter sport- och hemartiklar, med skönhetsprodukter på sista plats, rabatter inräknade. Elektronik och sportartiklar ser större variation inom ordervärden.</w:t>
+      </w:r>
+    </w:p>
+    <w:p>
+      <w:pPr>
+        <w:rPr>
+          <w:rFonts w:ascii="Times New Roman" w:eastAsia="Times New Roman" w:hAnsi="Times New Roman" w:cs="Times New Roman"/>
+          <w:sz w:val="24"/>
+          <w:szCs w:val="24"/>
+          <w:lang w:val="sv-SE"/>
+        </w:rPr>
+      </w:pPr>
+      <w:r>
+        <w:rPr>
+          <w:rFonts w:ascii="Times New Roman" w:eastAsia="Times New Roman" w:hAnsi="Times New Roman" w:cs="Times New Roman"/>
+          <w:sz w:val="24"/>
+          <w:szCs w:val="24"/>
+          <w:lang w:val="sv-SE"/>
+        </w:rPr>
+        <w:t xml:space="preserve">Småföretag, dock färre köp än konsumenter, står för </w:t>
+      </w:r>
+      <w:proofErr w:type="spellStart"/>
+      <w:r>
+        <w:rPr>
+          <w:rFonts w:ascii="Times New Roman" w:eastAsia="Times New Roman" w:hAnsi="Times New Roman" w:cs="Times New Roman"/>
+          <w:sz w:val="24"/>
+          <w:szCs w:val="24"/>
+          <w:lang w:val="sv-SE"/>
+        </w:rPr>
+        <w:t>mestadelen</w:t>
+      </w:r>
+      <w:proofErr w:type="spellEnd"/>
+      <w:r>
+        <w:rPr>
+          <w:rFonts w:ascii="Times New Roman" w:eastAsia="Times New Roman" w:hAnsi="Times New Roman" w:cs="Times New Roman"/>
+          <w:sz w:val="24"/>
+          <w:szCs w:val="24"/>
+          <w:lang w:val="sv-SE"/>
+        </w:rPr>
+        <w:t xml:space="preserve"> intäkter. Fåtalet </w:t>
+      </w:r>
+      <w:proofErr w:type="spellStart"/>
+      <w:r>
+        <w:rPr>
+          <w:rFonts w:ascii="Times New Roman" w:eastAsia="Times New Roman" w:hAnsi="Times New Roman" w:cs="Times New Roman"/>
+          <w:sz w:val="24"/>
+          <w:szCs w:val="24"/>
+          <w:lang w:val="sv-SE"/>
+        </w:rPr>
+        <w:t>ordrar</w:t>
+      </w:r>
+      <w:proofErr w:type="spellEnd"/>
+      <w:r>
+        <w:rPr>
+          <w:rFonts w:ascii="Times New Roman" w:eastAsia="Times New Roman" w:hAnsi="Times New Roman" w:cs="Times New Roman"/>
+          <w:sz w:val="24"/>
+          <w:szCs w:val="24"/>
+          <w:lang w:val="sv-SE"/>
+        </w:rPr>
+        <w:t xml:space="preserve"> gör medel-ordervärde, inkl. rabatter, högre än medianer, tecken på </w:t>
+      </w:r>
+      <w:proofErr w:type="spellStart"/>
+      <w:r>
+        <w:rPr>
+          <w:rFonts w:ascii="Times New Roman" w:eastAsia="Times New Roman" w:hAnsi="Times New Roman" w:cs="Times New Roman"/>
+          <w:sz w:val="24"/>
+          <w:szCs w:val="24"/>
+          <w:lang w:val="sv-SE"/>
+        </w:rPr>
+        <w:t>outliers</w:t>
+      </w:r>
+      <w:proofErr w:type="spellEnd"/>
+      <w:r>
+        <w:rPr>
+          <w:rFonts w:ascii="Times New Roman" w:eastAsia="Times New Roman" w:hAnsi="Times New Roman" w:cs="Times New Roman"/>
+          <w:sz w:val="24"/>
+          <w:szCs w:val="24"/>
+          <w:lang w:val="sv-SE"/>
+        </w:rPr>
+        <w:t xml:space="preserve"> påverkar snitten.</w:t>
+      </w:r>
+    </w:p>
+    <w:p>
+      <w:pPr>
+        <w:rPr>
+          <w:rFonts w:ascii="Times New Roman" w:eastAsia="Times New Roman" w:hAnsi="Times New Roman" w:cs="Times New Roman"/>
+          <w:sz w:val="24"/>
+          <w:szCs w:val="24"/>
+          <w:lang w:val="sv-SE"/>
+        </w:rPr>
+      </w:pPr>
+    </w:p>
+    <w:p>
+      <w:pPr>
+        <w:rPr>
+          <w:rFonts w:ascii="Times New Roman" w:eastAsia="Times New Roman" w:hAnsi="Times New Roman" w:cs="Times New Roman"/>
+          <w:sz w:val="24"/>
+          <w:szCs w:val="24"/>
+          <w:lang w:val="sv-SE"/>
+        </w:rPr>
+      </w:pPr>
+      <w:r>
+        <w:rPr>
+          <w:rFonts w:ascii="Times New Roman" w:eastAsia="Times New Roman" w:hAnsi="Times New Roman" w:cs="Times New Roman"/>
+          <w:sz w:val="24"/>
+          <w:szCs w:val="24"/>
+          <w:u w:val="single"/>
+          <w:lang w:val="sv-SE"/>
+        </w:rPr>
+        <w:t>Intäkter över tid:</w:t>
+      </w:r>
+    </w:p>
+    <w:p>
+      <w:pPr>
+        <w:rPr>
+          <w:rFonts w:ascii="Times New Roman" w:eastAsia="Times New Roman" w:hAnsi="Times New Roman" w:cs="Times New Roman"/>
+          <w:sz w:val="24"/>
+          <w:szCs w:val="24"/>
+          <w:lang w:val="sv-SE"/>
+        </w:rPr>
+      </w:pPr>
+      <w:r>
+        <w:rPr>
+          <w:rFonts w:ascii="Times New Roman" w:eastAsia="Times New Roman" w:hAnsi="Times New Roman" w:cs="Times New Roman"/>
+          <w:sz w:val="24"/>
+          <w:szCs w:val="24"/>
+          <w:lang w:val="sv-SE"/>
+        </w:rPr>
+        <w:t xml:space="preserve">Vintertid för med sig stor andel intäkt, även sommar. Vår och höst faller intäkterna. Regionalt och per </w:t>
+      </w:r>
+      <w:proofErr w:type="spellStart"/>
+      <w:r>
+        <w:rPr>
+          <w:rFonts w:ascii="Times New Roman" w:eastAsia="Times New Roman" w:hAnsi="Times New Roman" w:cs="Times New Roman"/>
+          <w:sz w:val="24"/>
+          <w:szCs w:val="24"/>
+          <w:lang w:val="sv-SE"/>
+        </w:rPr>
+        <w:t>kundtyp</w:t>
+      </w:r>
+      <w:proofErr w:type="spellEnd"/>
+      <w:r>
+        <w:rPr>
+          <w:rFonts w:ascii="Times New Roman" w:eastAsia="Times New Roman" w:hAnsi="Times New Roman" w:cs="Times New Roman"/>
+          <w:sz w:val="24"/>
+          <w:szCs w:val="24"/>
+          <w:lang w:val="sv-SE"/>
+        </w:rPr>
+        <w:t xml:space="preserve"> matchar ungefärligt mönstret, fast norr säljer mer än syd, och kundtyperna förutom VIP handlar för merparten.</w:t>
+      </w:r>
     </w:p>
     <w:p>
       <w:pPr>
@@ -709,6 +887,77 @@
           <w:szCs w:val="24"/>
         </w:rPr>
       </w:pPr>
+      <w:r>
+        <w:rPr>
+          <w:rFonts w:ascii="Times New Roman" w:eastAsia="Times New Roman" w:hAnsi="Times New Roman" w:cs="Times New Roman"/>
+          <w:sz w:val="24"/>
+          <w:szCs w:val="24"/>
+        </w:rPr>
+        <w:t xml:space="preserve">Elektronik och sport är främst säljande produkterna, med konsumenter och småföretag som bidrar med mera </w:t>
+      </w:r>
+      <w:proofErr w:type="spellStart"/>
+      <w:r>
+        <w:rPr>
+          <w:rFonts w:ascii="Times New Roman" w:eastAsia="Times New Roman" w:hAnsi="Times New Roman" w:cs="Times New Roman"/>
+          <w:sz w:val="24"/>
+          <w:szCs w:val="24"/>
+        </w:rPr>
+        <w:t>ordrar</w:t>
+      </w:r>
+      <w:proofErr w:type="spellEnd"/>
+      <w:r>
+        <w:rPr>
+          <w:rFonts w:ascii="Times New Roman" w:eastAsia="Times New Roman" w:hAnsi="Times New Roman" w:cs="Times New Roman"/>
+          <w:sz w:val="24"/>
+          <w:szCs w:val="24"/>
+        </w:rPr>
+        <w:t xml:space="preserve"> och lite mera intäkter, </w:t>
+      </w:r>
+      <w:proofErr w:type="spellStart"/>
+      <w:r>
+        <w:rPr>
+          <w:rFonts w:ascii="Times New Roman" w:eastAsia="Times New Roman" w:hAnsi="Times New Roman" w:cs="Times New Roman"/>
+          <w:sz w:val="24"/>
+          <w:szCs w:val="24"/>
+        </w:rPr>
+        <w:t>respektivt</w:t>
+      </w:r>
+      <w:proofErr w:type="spellEnd"/>
+      <w:r>
+        <w:rPr>
+          <w:rFonts w:ascii="Times New Roman" w:eastAsia="Times New Roman" w:hAnsi="Times New Roman" w:cs="Times New Roman"/>
+          <w:sz w:val="24"/>
+          <w:szCs w:val="24"/>
+        </w:rPr>
+        <w:t xml:space="preserve">, för företaget. Årssäsonger speglar </w:t>
+      </w:r>
+      <w:r>
+        <w:rPr>
+          <w:rFonts w:ascii="Times New Roman" w:eastAsia="Times New Roman" w:hAnsi="Times New Roman" w:cs="Times New Roman"/>
+          <w:sz w:val="24"/>
+          <w:szCs w:val="24"/>
+        </w:rPr>
+        <w:lastRenderedPageBreak/>
+        <w:t xml:space="preserve">rörlig efterfrågan som </w:t>
+      </w:r>
+      <w:proofErr w:type="spellStart"/>
+      <w:r>
+        <w:rPr>
+          <w:rFonts w:ascii="Times New Roman" w:eastAsia="Times New Roman" w:hAnsi="Times New Roman" w:cs="Times New Roman"/>
+          <w:sz w:val="24"/>
+          <w:szCs w:val="24"/>
+        </w:rPr>
+        <w:t>kundtyp</w:t>
+      </w:r>
+      <w:proofErr w:type="spellEnd"/>
+      <w:r>
+        <w:rPr>
+          <w:rFonts w:ascii="Times New Roman" w:eastAsia="Times New Roman" w:hAnsi="Times New Roman" w:cs="Times New Roman"/>
+          <w:sz w:val="24"/>
+          <w:szCs w:val="24"/>
+        </w:rPr>
+        <w:t xml:space="preserve"> och regioner bryter upp dynamiken till att norr, och återvändande kunder, är ledande bland övriga.</w:t>
+      </w:r>
     </w:p>
     <w:p>
       <w:pPr>

</xml_diff>

<commit_message>
La till förlängd slutsats.
</commit_message>
<xml_diff>
--- a/Grupp 3, R - rapport.docx
+++ b/Grupp 3, R - rapport.docx
@@ -957,6 +957,24 @@
           <w:szCs w:val="24"/>
         </w:rPr>
         <w:t xml:space="preserve"> och regioner bryter upp dynamiken till att norr, och återvändande kunder, är ledande bland övriga.</w:t>
+      </w:r>
+    </w:p>
+    <w:p>
+      <w:pPr>
+        <w:ind w:firstLine="720"/>
+        <w:rPr>
+          <w:rFonts w:ascii="Times New Roman" w:eastAsia="Times New Roman" w:hAnsi="Times New Roman" w:cs="Times New Roman"/>
+          <w:sz w:val="24"/>
+          <w:szCs w:val="24"/>
+        </w:rPr>
+      </w:pPr>
+      <w:r>
+        <w:rPr>
+          <w:rFonts w:ascii="Times New Roman" w:eastAsia="Times New Roman" w:hAnsi="Times New Roman" w:cs="Times New Roman"/>
+          <w:sz w:val="24"/>
+          <w:szCs w:val="24"/>
+        </w:rPr>
+        <w:t>Att se till lagersaldon och marknadsföring till kundsegment eller regionalt för mest säljande produktkategorier är en praktisk föraning rimlig att agera på, fast vidare analys må avslöja bekräftande eller dementerande perspektiv.</w:t>
       </w:r>
     </w:p>
     <w:p>

</xml_diff>